<commit_message>
Update docs and PDFs for footer icons, import/export, map print, Settings sections
Co-authored-by: Copilot <223556219+Copilot@users.noreply.github.com>
</commit_message>
<xml_diff>
--- a/docs/Return Visits & Contacts App Master Guide (V5).docx
+++ b/docs/Return Visits & Contacts App Master Guide (V5).docx
@@ -146,7 +146,7 @@
     <w:p>
       <w:pPr/>
       <w:r>
-        <w:t>No passphrase is required on first launch; the app opens directly. To protect the data, open Settings, choose Turn On Passphrase, and enter and confirm a passphrase of at least eight characters. On later launches, enter that passphrase to unlock the database. To change it, open Settings, enter the current passphrase, and enter and confirm a new passphrase. Existing exported backups continue to use the passphrase with which each backup was created. To stop using a passphrase, choose Turn Off Passphrase in Settings and enter the current passphrase once; the data is then stored unencrypted and the app opens without an unlock screen.</w:t>
+        <w:t>No passphrase is required on first launch; the app opens directly. To protect the data, open Settings → Passphrase, choose Turn On Passphrase, and enter and confirm a passphrase of at least eight characters. On later launches, enter that passphrase to unlock the database. To change it, open Settings → Passphrase, enter the current passphrase, and enter and confirm a new passphrase. Existing exported backups continue to use the passphrase with which each backup was created. To stop using a passphrase, choose Settings → Passphrase → Turn Off Passphrase and enter the current passphrase once; the data is then stored unencrypted and the app opens without an unlock screen.</w:t>
       </w:r>
     </w:p>
     <w:p>
@@ -178,7 +178,7 @@
     <w:p>
       <w:pPr/>
       <w:r>
-        <w:t>The contact list supports text search over names, email, phone, address, visit-note text, and assigned areas; urgency, city, region, and area filters; and newest-first, oldest-first, and first-name alphabetical sorting. City, region, and area filters follow the same hierarchy. Print Visible Contacts prints exactly the contacts shown by the current search and filters, confirms the count, groups each contact once under their most specific location, and includes available phone and email details plus only the latest visit note. The printer-friendly layout omits app controls.</w:t>
+        <w:t>The contact list supports text search over names, email, phone, address, visit-note text, and assigned areas; urgency, city, region, and area filters; and newest-first, oldest-first, and first-name alphabetical sorting. City, region, and area filters follow the same hierarchy. The printer icon in the bottom bar prints exactly the contacts shown by the current search and filters, confirms the count, groups each contact once under their most specific location, and includes available phone and email details plus only the latest visit note. The printer-friendly layout omits app controls.</w:t>
       </w:r>
     </w:p>
     <w:p>
@@ -242,7 +242,7 @@
     <w:p>
       <w:pPr/>
       <w:r>
-        <w:t>Choose Settings → Export Data Backup to download a JSON backup of settings and all contacts. If a passphrase is on, the backup is encrypted and requires its passphrase to restore; otherwise it is an unencrypted backup. The browser chooses the download destination; the app cannot select a folder. On iPhone, check Files → Downloads; elsewhere, check the browser’s Downloads location.</w:t>
+        <w:t>Choose Settings → Backup &amp; Restore → Back up everything (or the export icon at the bottom of the contact list) to download a JSON backup of settings and all contacts. If a passphrase is on, the backup is encrypted and requires its passphrase to restore; otherwise it is an unencrypted backup. The browser chooses the download destination; the app cannot select a folder. On iPhone, check Files → Downloads; elsewhere, check the browser’s Downloads location.</w:t>
       </w:r>
     </w:p>
     <w:p>
@@ -280,7 +280,7 @@
     <w:p>
       <w:pPr/>
       <w:r>
-        <w:t>The recipient can use the regular website or install the PWA. In Settings → Share a Contact, choose the encrypted file, enter its sharing passphrase, and confirm import. Import adds a new contact without replacing existing contacts, assigns a local ID, and stores it using the recipient device’s settings (encrypted if the recipient has turned on a passphrase).</w:t>
+        <w:t>The recipient can use the regular website or install the PWA. On the contact list, choose the import icon next to the blue + button, select one or several contact files, enter the sharing passphrase if a file is encrypted, and confirm import. Import adds a new contact without replacing existing contacts, assigns a local ID, and stores it using the recipient device’s settings (encrypted if the recipient has turned on a passphrase).</w:t>
       </w:r>
     </w:p>
     <w:p>

</xml_diff>

<commit_message>
Add 12-character passphrase minimum and recovery code
Co-authored-by: Copilot <223556219+Copilot@users.noreply.github.com>
</commit_message>
<xml_diff>
--- a/docs/Return Visits & Contacts App Master Guide (V5).docx
+++ b/docs/Return Visits & Contacts App Master Guide (V5).docx
@@ -132,7 +132,7 @@
     <w:p>
       <w:pPr/>
       <w:r>
-        <w:t>A passphrase is optional and is off by default; without one, the app opens immediately and stores settings and contacts unencrypted. A user can turn on a passphrase in Settings by choosing and confirming a passphrase of at least eight characters; the existing data is encrypted and verified before the unencrypted copies are replaced. Once a passphrase is on, it is required each time the app opens. A user can then change it by entering the existing passphrase and confirming a new one of at least eight characters. The settings and contacts are decrypted, re-encrypted with fresh encryption metadata, verified, and replaced atomically. Other browser/Home Screen copies and already-exported backups are not changed. There is no passphrase recovery; losing the current passphrase before changing it makes that copy's encrypted records unreadable.</w:t>
+        <w:t>A passphrase is optional and is off by default; without one, the app opens immediately and stores settings and contacts unencrypted. A user can turn on a passphrase in Settings by choosing and confirming a passphrase of at least 12 characters; the existing data is encrypted and verified before the unencrypted copies are replaced. Once a passphrase is on, it is required each time the app opens. A user can then change it by entering the existing passphrase and confirming a new one of at least 12 characters. The settings and contacts are decrypted, re-encrypted with fresh encryption metadata, verified, and replaced atomically. Other browser/Home Screen copies and already-exported backups are not changed. A random 25-character recovery code is shown once when a passphrase is set or changed; the encryption metadata stores a copy of the passphrase locked under that code, so the code can be typed in place of the passphrase to unlock the app, to change the passphrase, or to restore a backup (backups embed the metadata). A new code can be made from Settings with the current passphrase. Losing both the passphrase and the code makes that copy's encrypted records unreadable.</w:t>
       </w:r>
     </w:p>
     <w:p>
@@ -146,7 +146,7 @@
     <w:p>
       <w:pPr/>
       <w:r>
-        <w:t>No passphrase is required on first launch; the app opens directly. To protect the data, open Settings → Passphrase, choose Turn On Passphrase, and enter and confirm a passphrase of at least eight characters. On later launches, enter that passphrase to unlock the database. To change it, open Settings → Passphrase, enter the current passphrase, and enter and confirm a new passphrase. Existing exported backups continue to use the passphrase with which each backup was created. To stop using a passphrase, choose Settings → Passphrase → Turn Off Passphrase and enter the current passphrase once; the data is then stored unencrypted and the app opens without an unlock screen.</w:t>
+        <w:t>No passphrase is required on first launch; the app opens directly. To protect the data, open Settings → Passphrase, choose Turn On Passphrase, and enter and confirm a passphrase of at least 12 characters. On later launches, enter that passphrase to unlock the database. To change it, open Settings → Passphrase, enter the current passphrase, and enter and confirm a new passphrase. Existing exported backups continue to use the passphrase with which each backup was created. To stop using a passphrase, choose Settings → Passphrase → Turn Off Passphrase and enter the current passphrase once; the data is then stored unencrypted and the app opens without an unlock screen.</w:t>
       </w:r>
     </w:p>
     <w:p>

</xml_diff>

<commit_message>
Add optional Dropbox cloud backup and 10-day backup reminder
Co-authored-by: Copilot <223556219+Copilot@users.noreply.github.com>
</commit_message>
<xml_diff>
--- a/docs/Return Visits & Contacts App Master Guide (V5).docx
+++ b/docs/Return Visits & Contacts App Master Guide (V5).docx
@@ -260,7 +260,13 @@
     <w:p>
       <w:pPr/>
       <w:r>
-        <w:t>The monthly reminder begins without an immediate first-run prompt and is shown only when the device contains at least one contact. It is a reminder to open Settings and export; it does not automatically create or upload backups.</w:t>
+        <w:t>The app reminds the user after 10 days without a successful backup (file or Dropbox), shows the number of days, asks at most once a day, and resets the count only on a successful backup. With Dropbox connected, answering Yes backs up immediately; otherwise it opens Settings → Backup &amp; Restore.</w:t>
+      </w:r>
+    </w:p>
+    <w:p>
+      <w:pPr/>
+      <w:r>
+        <w:t>Optional cloud backup (off by default): Settings → Cloud backup lets the user connect their own Dropbox account. The app asks whether the user already has an account and, if not, shows the sign-up steps for the free Dropbox Basic plan (the app cannot create the account). Connection uses Dropbox's OAuth 2 authorization code flow with PKCE and the app's public app key, with access limited to the app's own folder (Apps/Return Visits). The app stores the resulting refresh token in browser LocalStorage and sends backups directly from the browser to Dropbox. It uploads a latest copy (latest.json) after changes (about 15 seconds later, or when the app is hidden) and on open when the last upload is more than a day old, plus at most one dated copy per day (backup-&lt;timestamp&gt;.json), keeping the newest 10. A web app cannot back up while closed. Backups use the same format as file backups: encrypted when a passphrase is on, otherwise plain (the user confirms this before connecting). The app never uploads automatically when the device has no contacts, so an empty new device cannot overwrite a good copy. Restore from Dropbox lists the latest and dated copies and uses the normal restore flow (passphrase or recovery code, confirmation before replacing data). Disconnect revokes the token and removes it from the browser; existing Dropbox files remain.</w:t>
       </w:r>
     </w:p>
     <w:p>

</xml_diff>